<commit_message>
docs: added StreamController.broadcast() and await for technique
</commit_message>
<xml_diff>
--- a/flutter_documents/f1_widgets_and_UI/f13_flutter_extras_of_basic.docx
+++ b/flutter_documents/f1_widgets_and_UI/f13_flutter_extras_of_basic.docx
@@ -1592,6 +1592,100 @@
           <w:sz w:val="32"/>
           <w:szCs w:val="32"/>
         </w:rPr>
+        <w:t>Platform Specific Asset Bundling</w:t>
+      </w:r>
+      <w:r>
+        <w:rPr>
+          <w:rFonts w:cs="Carlito"/>
+          <w:sz w:val="32"/>
+          <w:szCs w:val="32"/>
+        </w:rPr>
+        <w:t xml:space="preserve"> (in </w:t>
+      </w:r>
+      <w:proofErr w:type="spellStart"/>
+      <w:proofErr w:type="gramStart"/>
+      <w:r>
+        <w:rPr>
+          <w:rFonts w:cs="Carlito"/>
+          <w:b/>
+          <w:bCs/>
+          <w:sz w:val="32"/>
+          <w:szCs w:val="32"/>
+        </w:rPr>
+        <w:t>pubsec.yaml</w:t>
+      </w:r>
+      <w:proofErr w:type="spellEnd"/>
+      <w:proofErr w:type="gramEnd"/>
+      <w:r>
+        <w:rPr>
+          <w:rFonts w:cs="Carlito"/>
+          <w:sz w:val="32"/>
+          <w:szCs w:val="32"/>
+        </w:rPr>
+        <w:t>).</w:t>
+      </w:r>
+      <w:r>
+        <w:rPr>
+          <w:rFonts w:cs="Carlito"/>
+          <w:sz w:val="32"/>
+          <w:szCs w:val="32"/>
+        </w:rPr>
+        <w:t>…………….</w:t>
+      </w:r>
+    </w:p>
+    <w:p>
+      <w:pPr>
+        <w:pStyle w:val="ListParagraph"/>
+        <w:numPr>
+          <w:ilvl w:val="0"/>
+          <w:numId w:val="30"/>
+        </w:numPr>
+        <w:jc w:val="both"/>
+        <w:rPr>
+          <w:rFonts w:cs="Carlito"/>
+          <w:sz w:val="32"/>
+          <w:szCs w:val="32"/>
+        </w:rPr>
+      </w:pPr>
+      <w:r>
+        <w:rPr>
+          <w:rFonts w:cs="Carlito"/>
+          <w:b/>
+          <w:bCs/>
+          <w:sz w:val="32"/>
+          <w:szCs w:val="32"/>
+        </w:rPr>
+        <w:t>Flutter</w:t>
+      </w:r>
+      <w:r>
+        <w:rPr>
+          <w:rFonts w:cs="Carlito"/>
+          <w:sz w:val="32"/>
+          <w:szCs w:val="32"/>
+        </w:rPr>
+        <w:t xml:space="preserve"> Performance Tips……………………………………………….</w:t>
+      </w:r>
+    </w:p>
+    <w:p>
+      <w:pPr>
+        <w:pStyle w:val="ListParagraph"/>
+        <w:numPr>
+          <w:ilvl w:val="0"/>
+          <w:numId w:val="30"/>
+        </w:numPr>
+        <w:jc w:val="both"/>
+        <w:rPr>
+          <w:rFonts w:cs="Carlito"/>
+          <w:sz w:val="32"/>
+          <w:szCs w:val="32"/>
+        </w:rPr>
+      </w:pPr>
+      <w:r>
+        <w:rPr>
+          <w:rFonts w:cs="Carlito"/>
+          <w:sz w:val="32"/>
+          <w:szCs w:val="32"/>
+        </w:rPr>
         <w:t>More useful stuffs scroll below</w:t>
       </w:r>
     </w:p>
@@ -7409,55 +7503,7 @@
           <w:sz w:val="32"/>
           <w:szCs w:val="32"/>
         </w:rPr>
-        <w:t xml:space="preserve">=0; </w:t>
-      </w:r>
-      <w:proofErr w:type="spellStart"/>
-      <w:r>
-        <w:rPr>
-          <w:rFonts w:cs="Carlito"/>
-          <w:b/>
-          <w:bCs/>
-          <w:color w:val="D86DCB" w:themeColor="accent5" w:themeTint="99"/>
-          <w:sz w:val="32"/>
-          <w:szCs w:val="32"/>
-        </w:rPr>
-        <w:t>i</w:t>
-      </w:r>
-      <w:proofErr w:type="spellEnd"/>
-      <w:r>
-        <w:rPr>
-          <w:rFonts w:cs="Carlito"/>
-          <w:b/>
-          <w:bCs/>
-          <w:color w:val="D86DCB" w:themeColor="accent5" w:themeTint="99"/>
-          <w:sz w:val="32"/>
-          <w:szCs w:val="32"/>
-        </w:rPr>
-        <w:t xml:space="preserve">&lt;5; </w:t>
-      </w:r>
-      <w:proofErr w:type="spellStart"/>
-      <w:r>
-        <w:rPr>
-          <w:rFonts w:cs="Carlito"/>
-          <w:b/>
-          <w:bCs/>
-          <w:color w:val="D86DCB" w:themeColor="accent5" w:themeTint="99"/>
-          <w:sz w:val="32"/>
-          <w:szCs w:val="32"/>
-        </w:rPr>
-        <w:t>i</w:t>
-      </w:r>
-      <w:proofErr w:type="spellEnd"/>
-      <w:r>
-        <w:rPr>
-          <w:rFonts w:cs="Carlito"/>
-          <w:b/>
-          <w:bCs/>
-          <w:color w:val="D86DCB" w:themeColor="accent5" w:themeTint="99"/>
-          <w:sz w:val="32"/>
-          <w:szCs w:val="32"/>
-        </w:rPr>
-        <w:t>++)</w:t>
+        <w:t>=0; i&lt;5; i++)</w:t>
       </w:r>
     </w:p>
     <w:p>
@@ -32941,17 +32987,7 @@
           <w:sz w:val="32"/>
           <w:szCs w:val="32"/>
         </w:rPr>
-        <w:t xml:space="preserve">  </w:t>
-      </w:r>
-      <w:r>
-        <w:rPr>
-          <w:b/>
-          <w:bCs/>
-          <w:color w:val="D86DCB" w:themeColor="accent5" w:themeTint="99"/>
-          <w:sz w:val="32"/>
-          <w:szCs w:val="32"/>
-        </w:rPr>
-        <w:t>…</w:t>
+        <w:t xml:space="preserve">  …</w:t>
       </w:r>
     </w:p>
     <w:p>
@@ -33205,17 +33241,7 @@
           <w:sz w:val="32"/>
           <w:szCs w:val="32"/>
         </w:rPr>
-        <w:t>1);</w:t>
-      </w:r>
-      <w:r>
-        <w:rPr>
-          <w:b/>
-          <w:bCs/>
-          <w:color w:val="D86DCB" w:themeColor="accent5" w:themeTint="99"/>
-          <w:sz w:val="32"/>
-          <w:szCs w:val="32"/>
-        </w:rPr>
-        <w:t xml:space="preserve"> // Quits app</w:t>
+        <w:t>1); // Quits app</w:t>
       </w:r>
     </w:p>
     <w:p>
@@ -34062,18 +34088,7 @@
           <w:sz w:val="32"/>
           <w:szCs w:val="32"/>
         </w:rPr>
-        <w:t xml:space="preserve">  </w:t>
-      </w:r>
-      <w:r>
-        <w:rPr>
-          <w:rFonts w:cs="Carlito"/>
-          <w:b/>
-          <w:bCs/>
-          <w:color w:val="D86DCB" w:themeColor="accent5" w:themeTint="99"/>
-          <w:sz w:val="32"/>
-          <w:szCs w:val="32"/>
-        </w:rPr>
-        <w:t>…</w:t>
+        <w:t xml:space="preserve">  …</w:t>
       </w:r>
     </w:p>
     <w:p>
@@ -35009,18 +35024,7 @@
           <w:sz w:val="32"/>
           <w:szCs w:val="32"/>
         </w:rPr>
-        <w:t>FirebaseCrashlytics.instance</w:t>
-      </w:r>
-      <w:r>
-        <w:rPr>
-          <w:rFonts w:cs="Carlito"/>
-          <w:b/>
-          <w:bCs/>
-          <w:color w:val="D86DCB" w:themeColor="accent5" w:themeTint="99"/>
-          <w:sz w:val="32"/>
-          <w:szCs w:val="32"/>
-        </w:rPr>
-        <w:t>.recordFlutterError</w:t>
+        <w:t>FirebaseCrashlytics.instance.recordFlutterError</w:t>
       </w:r>
       <w:proofErr w:type="spellEnd"/>
       <w:proofErr w:type="gramEnd"/>
@@ -35253,18 +35257,7 @@
           <w:sz w:val="32"/>
           <w:szCs w:val="32"/>
         </w:rPr>
-        <w:t>A</w:t>
-      </w:r>
-      <w:r>
-        <w:rPr>
-          <w:rFonts w:cs="Carlito"/>
-          <w:b/>
-          <w:bCs/>
-          <w:color w:val="D86DCB" w:themeColor="accent5" w:themeTint="99"/>
-          <w:sz w:val="32"/>
-          <w:szCs w:val="32"/>
-        </w:rPr>
-        <w:t>ppLogger.error</w:t>
+        <w:t>AppLogger.error</w:t>
       </w:r>
       <w:proofErr w:type="spellEnd"/>
       <w:r>
@@ -35398,40 +35391,7 @@
           <w:sz w:val="32"/>
           <w:szCs w:val="32"/>
         </w:rPr>
-        <w:t>FirebaseC</w:t>
-      </w:r>
-      <w:r>
-        <w:rPr>
-          <w:rFonts w:cs="Carlito"/>
-          <w:b/>
-          <w:bCs/>
-          <w:color w:val="D86DCB" w:themeColor="accent5" w:themeTint="99"/>
-          <w:sz w:val="32"/>
-          <w:szCs w:val="32"/>
-        </w:rPr>
-        <w:t>rashlytics</w:t>
-      </w:r>
-      <w:r>
-        <w:rPr>
-          <w:rFonts w:cs="Carlito"/>
-          <w:b/>
-          <w:bCs/>
-          <w:color w:val="D86DCB" w:themeColor="accent5" w:themeTint="99"/>
-          <w:sz w:val="32"/>
-          <w:szCs w:val="32"/>
-        </w:rPr>
-        <w:t>.instance</w:t>
-      </w:r>
-      <w:r>
-        <w:rPr>
-          <w:rFonts w:cs="Carlito"/>
-          <w:b/>
-          <w:bCs/>
-          <w:color w:val="D86DCB" w:themeColor="accent5" w:themeTint="99"/>
-          <w:sz w:val="32"/>
-          <w:szCs w:val="32"/>
-        </w:rPr>
-        <w:t>.recordError</w:t>
+        <w:t>FirebaseCrashlytics.instance.recordError</w:t>
       </w:r>
       <w:proofErr w:type="spellEnd"/>
       <w:proofErr w:type="gramEnd"/>
@@ -35797,18 +35757,7 @@
           <w:sz w:val="32"/>
           <w:szCs w:val="32"/>
         </w:rPr>
-        <w:t xml:space="preserve">   </w:t>
-      </w:r>
-      <w:r>
-        <w:rPr>
-          <w:rFonts w:cs="Carlito"/>
-          <w:b/>
-          <w:bCs/>
-          <w:color w:val="D86DCB" w:themeColor="accent5" w:themeTint="99"/>
-          <w:sz w:val="32"/>
-          <w:szCs w:val="32"/>
-        </w:rPr>
-        <w:t>…</w:t>
+        <w:t xml:space="preserve">   …</w:t>
       </w:r>
     </w:p>
     <w:p>
@@ -35833,18 +35782,7 @@
           <w:szCs w:val="32"/>
         </w:rPr>
         <w:lastRenderedPageBreak/>
-        <w:t xml:space="preserve">   </w:t>
-      </w:r>
-      <w:r>
-        <w:rPr>
-          <w:rFonts w:cs="Carlito"/>
-          <w:b/>
-          <w:bCs/>
-          <w:color w:val="D86DCB" w:themeColor="accent5" w:themeTint="99"/>
-          <w:sz w:val="32"/>
-          <w:szCs w:val="32"/>
-        </w:rPr>
-        <w:t xml:space="preserve">await </w:t>
+        <w:t xml:space="preserve">   await </w:t>
       </w:r>
       <w:proofErr w:type="spellStart"/>
       <w:proofErr w:type="gramStart"/>
@@ -39724,7 +39662,27 @@
           <w:sz w:val="32"/>
           <w:szCs w:val="32"/>
         </w:rPr>
-        <w:t xml:space="preserve">Platform Specific Asset Building (In </w:t>
+        <w:t>Platform Specific Asset Bu</w:t>
+      </w:r>
+      <w:r>
+        <w:rPr>
+          <w:rFonts w:cs="Carlito"/>
+          <w:b/>
+          <w:bCs/>
+          <w:sz w:val="32"/>
+          <w:szCs w:val="32"/>
+        </w:rPr>
+        <w:t>ndling</w:t>
+      </w:r>
+      <w:r>
+        <w:rPr>
+          <w:rFonts w:cs="Carlito"/>
+          <w:b/>
+          <w:bCs/>
+          <w:sz w:val="32"/>
+          <w:szCs w:val="32"/>
+        </w:rPr>
+        <w:t xml:space="preserve"> (In </w:t>
       </w:r>
       <w:proofErr w:type="spellStart"/>
       <w:proofErr w:type="gramStart"/>
@@ -39830,6 +39788,861 @@
       <w:pPr>
         <w:jc w:val="both"/>
         <w:rPr>
+          <w:b/>
+          <w:bCs/>
+          <w:sz w:val="32"/>
+          <w:szCs w:val="32"/>
+        </w:rPr>
+      </w:pPr>
+      <w:r>
+        <w:rPr>
+          <w:b/>
+          <w:bCs/>
+          <w:sz w:val="32"/>
+          <w:szCs w:val="32"/>
+        </w:rPr>
+        <w:t>Mono-repos in Flutter:</w:t>
+      </w:r>
+    </w:p>
+    <w:p>
+      <w:pPr>
+        <w:jc w:val="both"/>
+        <w:rPr>
+          <w:sz w:val="32"/>
+          <w:szCs w:val="32"/>
+        </w:rPr>
+      </w:pPr>
+      <w:r>
+        <w:rPr>
+          <w:sz w:val="32"/>
+          <w:szCs w:val="32"/>
+        </w:rPr>
+        <w:t># See p1 programming mental models</w:t>
+      </w:r>
+    </w:p>
+    <w:p>
+      <w:pPr>
+        <w:jc w:val="both"/>
+        <w:rPr>
+          <w:sz w:val="32"/>
+          <w:szCs w:val="32"/>
+        </w:rPr>
+      </w:pPr>
+    </w:p>
+    <w:p>
+      <w:pPr>
+        <w:jc w:val="center"/>
+        <w:rPr>
+          <w:sz w:val="32"/>
+          <w:szCs w:val="32"/>
+        </w:rPr>
+      </w:pPr>
+      <w:r>
+        <w:rPr>
+          <w:sz w:val="32"/>
+          <w:szCs w:val="32"/>
+        </w:rPr>
+        <w:t>Break</w:t>
+      </w:r>
+    </w:p>
+    <w:p>
+      <w:pPr>
+        <w:jc w:val="both"/>
+        <w:rPr>
+          <w:sz w:val="32"/>
+          <w:szCs w:val="32"/>
+        </w:rPr>
+      </w:pPr>
+    </w:p>
+    <w:p>
+      <w:pPr>
+        <w:jc w:val="both"/>
+        <w:rPr>
+          <w:b/>
+          <w:bCs/>
+          <w:sz w:val="32"/>
+          <w:szCs w:val="32"/>
+        </w:rPr>
+      </w:pPr>
+      <w:r>
+        <w:rPr>
+          <w:b/>
+          <w:bCs/>
+          <w:sz w:val="32"/>
+          <w:szCs w:val="32"/>
+        </w:rPr>
+        <w:t>Flutter Performance Tips:</w:t>
+      </w:r>
+    </w:p>
+    <w:p>
+      <w:pPr>
+        <w:pStyle w:val="ListParagraph"/>
+        <w:numPr>
+          <w:ilvl w:val="0"/>
+          <w:numId w:val="43"/>
+        </w:numPr>
+        <w:jc w:val="both"/>
+        <w:rPr>
+          <w:sz w:val="32"/>
+          <w:szCs w:val="32"/>
+        </w:rPr>
+      </w:pPr>
+      <w:r>
+        <w:rPr>
+          <w:sz w:val="32"/>
+          <w:szCs w:val="32"/>
+        </w:rPr>
+        <w:t xml:space="preserve">Use const widgets wherever possible – fewer rebuilds = faster apps. </w:t>
+      </w:r>
+      <w:r>
+        <w:rPr>
+          <w:rFonts w:ascii="Segoe UI Emoji" w:hAnsi="Segoe UI Emoji" w:cs="Segoe UI Emoji"/>
+          <w:sz w:val="32"/>
+          <w:szCs w:val="32"/>
+        </w:rPr>
+        <w:t>⚡</w:t>
+      </w:r>
+    </w:p>
+    <w:p>
+      <w:pPr>
+        <w:pStyle w:val="ListParagraph"/>
+        <w:numPr>
+          <w:ilvl w:val="0"/>
+          <w:numId w:val="43"/>
+        </w:numPr>
+        <w:jc w:val="both"/>
+        <w:rPr>
+          <w:sz w:val="32"/>
+          <w:szCs w:val="32"/>
+        </w:rPr>
+      </w:pPr>
+      <w:r>
+        <w:rPr>
+          <w:sz w:val="32"/>
+          <w:szCs w:val="32"/>
+        </w:rPr>
+        <w:t xml:space="preserve">Rebuild only what’s needed – leverage keys, </w:t>
+      </w:r>
+      <w:proofErr w:type="spellStart"/>
+      <w:r>
+        <w:rPr>
+          <w:b/>
+          <w:bCs/>
+          <w:sz w:val="32"/>
+          <w:szCs w:val="32"/>
+        </w:rPr>
+        <w:t>ValueKey</w:t>
+      </w:r>
+      <w:proofErr w:type="spellEnd"/>
+      <w:r>
+        <w:rPr>
+          <w:sz w:val="32"/>
+          <w:szCs w:val="32"/>
+        </w:rPr>
+        <w:t xml:space="preserve">, or separate widgets. </w:t>
+      </w:r>
+      <w:r>
+        <w:rPr>
+          <w:rFonts w:ascii="Segoe UI Emoji" w:hAnsi="Segoe UI Emoji" w:cs="Segoe UI Emoji"/>
+          <w:sz w:val="32"/>
+          <w:szCs w:val="32"/>
+        </w:rPr>
+        <w:t>💡</w:t>
+      </w:r>
+    </w:p>
+    <w:p>
+      <w:pPr>
+        <w:pStyle w:val="ListParagraph"/>
+        <w:numPr>
+          <w:ilvl w:val="0"/>
+          <w:numId w:val="43"/>
+        </w:numPr>
+        <w:jc w:val="both"/>
+        <w:rPr>
+          <w:sz w:val="32"/>
+          <w:szCs w:val="32"/>
+        </w:rPr>
+      </w:pPr>
+      <w:r>
+        <w:rPr>
+          <w:sz w:val="32"/>
+          <w:szCs w:val="32"/>
+        </w:rPr>
+        <w:t xml:space="preserve">Efficient state management – prefer </w:t>
+      </w:r>
+      <w:proofErr w:type="spellStart"/>
+      <w:r>
+        <w:rPr>
+          <w:b/>
+          <w:bCs/>
+          <w:sz w:val="32"/>
+          <w:szCs w:val="32"/>
+        </w:rPr>
+        <w:t>GetX</w:t>
+      </w:r>
+      <w:proofErr w:type="spellEnd"/>
+      <w:r>
+        <w:rPr>
+          <w:sz w:val="32"/>
+          <w:szCs w:val="32"/>
+        </w:rPr>
+        <w:t xml:space="preserve">, </w:t>
+      </w:r>
+      <w:r>
+        <w:rPr>
+          <w:b/>
+          <w:bCs/>
+          <w:sz w:val="32"/>
+          <w:szCs w:val="32"/>
+        </w:rPr>
+        <w:t>Riverpod</w:t>
+      </w:r>
+      <w:r>
+        <w:rPr>
+          <w:sz w:val="32"/>
+          <w:szCs w:val="32"/>
+        </w:rPr>
+        <w:t xml:space="preserve">, or Bloc over </w:t>
+      </w:r>
+      <w:proofErr w:type="spellStart"/>
+      <w:r>
+        <w:rPr>
+          <w:b/>
+          <w:bCs/>
+          <w:sz w:val="32"/>
+          <w:szCs w:val="32"/>
+        </w:rPr>
+        <w:t>setState</w:t>
+      </w:r>
+      <w:proofErr w:type="spellEnd"/>
+      <w:r>
+        <w:rPr>
+          <w:sz w:val="32"/>
+          <w:szCs w:val="32"/>
+        </w:rPr>
+        <w:t xml:space="preserve"> everywhere.</w:t>
+      </w:r>
+    </w:p>
+    <w:p>
+      <w:pPr>
+        <w:pStyle w:val="ListParagraph"/>
+        <w:numPr>
+          <w:ilvl w:val="0"/>
+          <w:numId w:val="43"/>
+        </w:numPr>
+        <w:jc w:val="both"/>
+        <w:rPr>
+          <w:sz w:val="32"/>
+          <w:szCs w:val="32"/>
+        </w:rPr>
+      </w:pPr>
+      <w:r>
+        <w:rPr>
+          <w:sz w:val="32"/>
+          <w:szCs w:val="32"/>
+        </w:rPr>
+        <w:t>Pagination &amp; lazy loading – don’t load all data at once; save memory.</w:t>
+      </w:r>
+    </w:p>
+    <w:p>
+      <w:pPr>
+        <w:pStyle w:val="ListParagraph"/>
+        <w:numPr>
+          <w:ilvl w:val="0"/>
+          <w:numId w:val="43"/>
+        </w:numPr>
+        <w:jc w:val="both"/>
+        <w:rPr>
+          <w:sz w:val="32"/>
+          <w:szCs w:val="32"/>
+        </w:rPr>
+      </w:pPr>
+      <w:r>
+        <w:rPr>
+          <w:sz w:val="32"/>
+          <w:szCs w:val="32"/>
+        </w:rPr>
+        <w:t xml:space="preserve">Builder widgets – </w:t>
+      </w:r>
+      <w:proofErr w:type="spellStart"/>
+      <w:r>
+        <w:rPr>
+          <w:b/>
+          <w:bCs/>
+          <w:sz w:val="32"/>
+          <w:szCs w:val="32"/>
+        </w:rPr>
+        <w:t>ListView.builder</w:t>
+      </w:r>
+      <w:proofErr w:type="spellEnd"/>
+      <w:r>
+        <w:rPr>
+          <w:sz w:val="32"/>
+          <w:szCs w:val="32"/>
+        </w:rPr>
+        <w:t xml:space="preserve"> or </w:t>
+      </w:r>
+      <w:proofErr w:type="spellStart"/>
+      <w:r>
+        <w:rPr>
+          <w:b/>
+          <w:bCs/>
+          <w:sz w:val="32"/>
+          <w:szCs w:val="32"/>
+        </w:rPr>
+        <w:t>GridView.builder</w:t>
+      </w:r>
+      <w:proofErr w:type="spellEnd"/>
+      <w:r>
+        <w:rPr>
+          <w:b/>
+          <w:bCs/>
+          <w:sz w:val="32"/>
+          <w:szCs w:val="32"/>
+        </w:rPr>
+        <w:t xml:space="preserve"> </w:t>
+      </w:r>
+      <w:r>
+        <w:rPr>
+          <w:sz w:val="32"/>
+          <w:szCs w:val="32"/>
+        </w:rPr>
+        <w:t>reduces memory usage.</w:t>
+      </w:r>
+    </w:p>
+    <w:p>
+      <w:pPr>
+        <w:pStyle w:val="ListParagraph"/>
+        <w:numPr>
+          <w:ilvl w:val="0"/>
+          <w:numId w:val="43"/>
+        </w:numPr>
+        <w:jc w:val="both"/>
+        <w:rPr>
+          <w:sz w:val="32"/>
+          <w:szCs w:val="32"/>
+        </w:rPr>
+      </w:pPr>
+      <w:r>
+        <w:rPr>
+          <w:sz w:val="32"/>
+          <w:szCs w:val="32"/>
+        </w:rPr>
+        <w:t xml:space="preserve">Optimize images – compress assets, scale properly, or use </w:t>
+      </w:r>
+      <w:proofErr w:type="spellStart"/>
+      <w:r>
+        <w:rPr>
+          <w:b/>
+          <w:bCs/>
+          <w:sz w:val="32"/>
+          <w:szCs w:val="32"/>
+        </w:rPr>
+        <w:t>CachedNetworkImage</w:t>
+      </w:r>
+      <w:proofErr w:type="spellEnd"/>
+      <w:r>
+        <w:rPr>
+          <w:sz w:val="32"/>
+          <w:szCs w:val="32"/>
+        </w:rPr>
+        <w:t>.</w:t>
+      </w:r>
+    </w:p>
+    <w:p>
+      <w:pPr>
+        <w:pStyle w:val="ListParagraph"/>
+        <w:numPr>
+          <w:ilvl w:val="0"/>
+          <w:numId w:val="43"/>
+        </w:numPr>
+        <w:jc w:val="both"/>
+        <w:rPr>
+          <w:sz w:val="32"/>
+          <w:szCs w:val="32"/>
+        </w:rPr>
+      </w:pPr>
+      <w:r>
+        <w:rPr>
+          <w:sz w:val="32"/>
+          <w:szCs w:val="32"/>
+        </w:rPr>
+        <w:t>Flatten widget trees – avoid deep nesting to reduce overdraw.</w:t>
+      </w:r>
+    </w:p>
+    <w:p>
+      <w:pPr>
+        <w:pStyle w:val="ListParagraph"/>
+        <w:numPr>
+          <w:ilvl w:val="0"/>
+          <w:numId w:val="43"/>
+        </w:numPr>
+        <w:jc w:val="both"/>
+        <w:rPr>
+          <w:sz w:val="32"/>
+          <w:szCs w:val="32"/>
+        </w:rPr>
+      </w:pPr>
+      <w:r>
+        <w:rPr>
+          <w:sz w:val="32"/>
+          <w:szCs w:val="32"/>
+        </w:rPr>
+        <w:t xml:space="preserve">Isolate heavy widgets – </w:t>
+      </w:r>
+      <w:proofErr w:type="spellStart"/>
+      <w:r>
+        <w:rPr>
+          <w:b/>
+          <w:bCs/>
+          <w:sz w:val="32"/>
+          <w:szCs w:val="32"/>
+        </w:rPr>
+        <w:t>RepaintBoundary</w:t>
+      </w:r>
+      <w:proofErr w:type="spellEnd"/>
+      <w:r>
+        <w:rPr>
+          <w:b/>
+          <w:bCs/>
+          <w:sz w:val="32"/>
+          <w:szCs w:val="32"/>
+        </w:rPr>
+        <w:t xml:space="preserve"> </w:t>
+      </w:r>
+      <w:r>
+        <w:rPr>
+          <w:sz w:val="32"/>
+          <w:szCs w:val="32"/>
+        </w:rPr>
+        <w:t>helps for charts or animations.</w:t>
+      </w:r>
+    </w:p>
+    <w:p>
+      <w:pPr>
+        <w:pStyle w:val="ListParagraph"/>
+        <w:numPr>
+          <w:ilvl w:val="0"/>
+          <w:numId w:val="43"/>
+        </w:numPr>
+        <w:jc w:val="both"/>
+        <w:rPr>
+          <w:sz w:val="32"/>
+          <w:szCs w:val="32"/>
+        </w:rPr>
+      </w:pPr>
+      <w:r>
+        <w:rPr>
+          <w:sz w:val="32"/>
+          <w:szCs w:val="32"/>
+        </w:rPr>
+        <w:lastRenderedPageBreak/>
+        <w:t>Debounce user input – prevent flooding API calls from search bars.</w:t>
+      </w:r>
+    </w:p>
+    <w:p>
+      <w:pPr>
+        <w:pStyle w:val="ListParagraph"/>
+        <w:numPr>
+          <w:ilvl w:val="0"/>
+          <w:numId w:val="43"/>
+        </w:numPr>
+        <w:jc w:val="both"/>
+        <w:rPr>
+          <w:sz w:val="32"/>
+          <w:szCs w:val="32"/>
+        </w:rPr>
+      </w:pPr>
+      <w:r>
+        <w:rPr>
+          <w:sz w:val="32"/>
+          <w:szCs w:val="32"/>
+        </w:rPr>
+        <w:t>Dispose unused async calls – cancel streams, timers, or subscriptions.</w:t>
+      </w:r>
+    </w:p>
+    <w:p>
+      <w:pPr>
+        <w:pStyle w:val="ListParagraph"/>
+        <w:numPr>
+          <w:ilvl w:val="0"/>
+          <w:numId w:val="43"/>
+        </w:numPr>
+        <w:jc w:val="both"/>
+        <w:rPr>
+          <w:sz w:val="32"/>
+          <w:szCs w:val="32"/>
+        </w:rPr>
+      </w:pPr>
+      <w:r>
+        <w:rPr>
+          <w:sz w:val="32"/>
+          <w:szCs w:val="32"/>
+        </w:rPr>
+        <w:t xml:space="preserve">Optimize animations – use </w:t>
+      </w:r>
+      <w:proofErr w:type="spellStart"/>
+      <w:r>
+        <w:rPr>
+          <w:b/>
+          <w:bCs/>
+          <w:sz w:val="32"/>
+          <w:szCs w:val="32"/>
+        </w:rPr>
+        <w:t>TweenAnimationBuilder</w:t>
+      </w:r>
+      <w:proofErr w:type="spellEnd"/>
+      <w:r>
+        <w:rPr>
+          <w:sz w:val="32"/>
+          <w:szCs w:val="32"/>
+        </w:rPr>
+        <w:t xml:space="preserve"> or </w:t>
+      </w:r>
+      <w:proofErr w:type="spellStart"/>
+      <w:r>
+        <w:rPr>
+          <w:b/>
+          <w:bCs/>
+          <w:sz w:val="32"/>
+          <w:szCs w:val="32"/>
+        </w:rPr>
+        <w:t>AnimatedBuilder</w:t>
+      </w:r>
+      <w:proofErr w:type="spellEnd"/>
+      <w:r>
+        <w:rPr>
+          <w:sz w:val="32"/>
+          <w:szCs w:val="32"/>
+        </w:rPr>
+        <w:t>.</w:t>
+      </w:r>
+    </w:p>
+    <w:p>
+      <w:pPr>
+        <w:pStyle w:val="ListParagraph"/>
+        <w:numPr>
+          <w:ilvl w:val="0"/>
+          <w:numId w:val="43"/>
+        </w:numPr>
+        <w:jc w:val="both"/>
+        <w:rPr>
+          <w:sz w:val="32"/>
+          <w:szCs w:val="32"/>
+        </w:rPr>
+      </w:pPr>
+      <w:r>
+        <w:rPr>
+          <w:sz w:val="32"/>
+          <w:szCs w:val="32"/>
+        </w:rPr>
+        <w:t xml:space="preserve">Profile your app – always check memory, rebuilds, and FPS with Flutter </w:t>
+      </w:r>
+      <w:proofErr w:type="spellStart"/>
+      <w:r>
+        <w:rPr>
+          <w:sz w:val="32"/>
+          <w:szCs w:val="32"/>
+        </w:rPr>
+        <w:t>DevTools</w:t>
+      </w:r>
+      <w:proofErr w:type="spellEnd"/>
+      <w:r>
+        <w:rPr>
+          <w:sz w:val="32"/>
+          <w:szCs w:val="32"/>
+        </w:rPr>
+        <w:t>.</w:t>
+      </w:r>
+    </w:p>
+    <w:p>
+      <w:pPr>
+        <w:pStyle w:val="ListParagraph"/>
+        <w:numPr>
+          <w:ilvl w:val="0"/>
+          <w:numId w:val="43"/>
+        </w:numPr>
+        <w:jc w:val="both"/>
+        <w:rPr>
+          <w:sz w:val="32"/>
+          <w:szCs w:val="32"/>
+        </w:rPr>
+      </w:pPr>
+      <w:r>
+        <w:rPr>
+          <w:sz w:val="32"/>
+          <w:szCs w:val="32"/>
+        </w:rPr>
+        <w:t>Offload heavy computations to Isolates.</w:t>
+      </w:r>
+    </w:p>
+    <w:p>
+      <w:pPr>
+        <w:pStyle w:val="ListParagraph"/>
+        <w:numPr>
+          <w:ilvl w:val="0"/>
+          <w:numId w:val="43"/>
+        </w:numPr>
+        <w:jc w:val="both"/>
+        <w:rPr>
+          <w:sz w:val="32"/>
+          <w:szCs w:val="32"/>
+        </w:rPr>
+      </w:pPr>
+      <w:r>
+        <w:rPr>
+          <w:sz w:val="32"/>
+          <w:szCs w:val="32"/>
+        </w:rPr>
+        <w:t>Optimize database queries – lazy load, index, and limit data.</w:t>
+      </w:r>
+    </w:p>
+    <w:p>
+      <w:pPr>
+        <w:pStyle w:val="ListParagraph"/>
+        <w:numPr>
+          <w:ilvl w:val="0"/>
+          <w:numId w:val="43"/>
+        </w:numPr>
+        <w:jc w:val="both"/>
+        <w:rPr>
+          <w:sz w:val="32"/>
+          <w:szCs w:val="32"/>
+        </w:rPr>
+      </w:pPr>
+      <w:r>
+        <w:rPr>
+          <w:sz w:val="32"/>
+          <w:szCs w:val="32"/>
+        </w:rPr>
+        <w:t>Cache (Repository Layer) network responses to reduce repeated API calls.</w:t>
+      </w:r>
+    </w:p>
+    <w:p>
+      <w:pPr>
+        <w:pStyle w:val="ListParagraph"/>
+        <w:numPr>
+          <w:ilvl w:val="0"/>
+          <w:numId w:val="43"/>
+        </w:numPr>
+        <w:jc w:val="both"/>
+        <w:rPr>
+          <w:sz w:val="32"/>
+          <w:szCs w:val="32"/>
+        </w:rPr>
+      </w:pPr>
+      <w:r>
+        <w:rPr>
+          <w:sz w:val="32"/>
+          <w:szCs w:val="32"/>
+        </w:rPr>
+        <w:t xml:space="preserve">Use </w:t>
+      </w:r>
+      <w:r>
+        <w:rPr>
+          <w:b/>
+          <w:bCs/>
+          <w:sz w:val="32"/>
+          <w:szCs w:val="32"/>
+        </w:rPr>
+        <w:t>const</w:t>
+      </w:r>
+      <w:r>
+        <w:rPr>
+          <w:sz w:val="32"/>
+          <w:szCs w:val="32"/>
+        </w:rPr>
+        <w:t xml:space="preserve"> &amp; </w:t>
+      </w:r>
+      <w:r>
+        <w:rPr>
+          <w:b/>
+          <w:bCs/>
+          <w:sz w:val="32"/>
+          <w:szCs w:val="32"/>
+        </w:rPr>
+        <w:t>final</w:t>
+      </w:r>
+      <w:r>
+        <w:rPr>
+          <w:sz w:val="32"/>
+          <w:szCs w:val="32"/>
+        </w:rPr>
+        <w:t xml:space="preserve"> wisely to prevent unnecessary rebuilds.</w:t>
+      </w:r>
+    </w:p>
+    <w:p>
+      <w:pPr>
+        <w:pStyle w:val="ListParagraph"/>
+        <w:numPr>
+          <w:ilvl w:val="0"/>
+          <w:numId w:val="43"/>
+        </w:numPr>
+        <w:jc w:val="both"/>
+        <w:rPr>
+          <w:sz w:val="32"/>
+          <w:szCs w:val="32"/>
+        </w:rPr>
+      </w:pPr>
+      <w:r>
+        <w:rPr>
+          <w:sz w:val="32"/>
+          <w:szCs w:val="32"/>
+        </w:rPr>
+        <w:t xml:space="preserve">Minimize repaints with </w:t>
+      </w:r>
+      <w:proofErr w:type="spellStart"/>
+      <w:r>
+        <w:rPr>
+          <w:b/>
+          <w:bCs/>
+          <w:sz w:val="32"/>
+          <w:szCs w:val="32"/>
+        </w:rPr>
+        <w:t>RepaintBoundary</w:t>
+      </w:r>
+      <w:proofErr w:type="spellEnd"/>
+      <w:r>
+        <w:rPr>
+          <w:sz w:val="32"/>
+          <w:szCs w:val="32"/>
+        </w:rPr>
+        <w:t xml:space="preserve"> for animations.</w:t>
+      </w:r>
+    </w:p>
+    <w:p>
+      <w:pPr>
+        <w:pStyle w:val="ListParagraph"/>
+        <w:numPr>
+          <w:ilvl w:val="0"/>
+          <w:numId w:val="43"/>
+        </w:numPr>
+        <w:jc w:val="both"/>
+        <w:rPr>
+          <w:sz w:val="32"/>
+          <w:szCs w:val="32"/>
+        </w:rPr>
+      </w:pPr>
+      <w:r>
+        <w:rPr>
+          <w:sz w:val="32"/>
+          <w:szCs w:val="32"/>
+        </w:rPr>
+        <w:t>Avoid blocking the main thread – async everything.</w:t>
+      </w:r>
+    </w:p>
+    <w:p>
+      <w:pPr>
+        <w:pStyle w:val="ListParagraph"/>
+        <w:numPr>
+          <w:ilvl w:val="0"/>
+          <w:numId w:val="43"/>
+        </w:numPr>
+        <w:jc w:val="both"/>
+        <w:rPr>
+          <w:sz w:val="32"/>
+          <w:szCs w:val="32"/>
+        </w:rPr>
+      </w:pPr>
+      <w:r>
+        <w:rPr>
+          <w:sz w:val="32"/>
+          <w:szCs w:val="32"/>
+        </w:rPr>
+        <w:t xml:space="preserve">Optimize image &amp; media loading – placeholders, lazy loading, </w:t>
+      </w:r>
+      <w:proofErr w:type="spellStart"/>
+      <w:r>
+        <w:rPr>
+          <w:b/>
+          <w:bCs/>
+          <w:sz w:val="32"/>
+          <w:szCs w:val="32"/>
+        </w:rPr>
+        <w:t>WebP</w:t>
+      </w:r>
+      <w:proofErr w:type="spellEnd"/>
+      <w:r>
+        <w:rPr>
+          <w:sz w:val="32"/>
+          <w:szCs w:val="32"/>
+        </w:rPr>
+        <w:t>, streaming.</w:t>
+      </w:r>
+    </w:p>
+    <w:p>
+      <w:pPr>
+        <w:jc w:val="both"/>
+        <w:rPr>
+          <w:sz w:val="32"/>
+          <w:szCs w:val="32"/>
+        </w:rPr>
+      </w:pPr>
+      <w:r>
+        <w:rPr>
+          <w:sz w:val="32"/>
+          <w:szCs w:val="32"/>
+        </w:rPr>
+        <w:t xml:space="preserve"># </w:t>
+      </w:r>
+      <w:r>
+        <w:rPr>
+          <w:rFonts w:ascii="Segoe UI Emoji" w:hAnsi="Segoe UI Emoji" w:cs="Segoe UI Emoji"/>
+          <w:sz w:val="32"/>
+          <w:szCs w:val="32"/>
+        </w:rPr>
+        <w:t>✨</w:t>
+      </w:r>
+      <w:r>
+        <w:rPr>
+          <w:sz w:val="32"/>
+          <w:szCs w:val="32"/>
+        </w:rPr>
+        <w:t xml:space="preserve"> Small changes like these may seem minor, but they dramatically improve app speed, responsiveness, and user experience.</w:t>
+      </w:r>
+    </w:p>
+    <w:p>
+      <w:pPr>
+        <w:jc w:val="both"/>
+        <w:rPr>
+          <w:rFonts w:cs="Carlito"/>
+          <w:sz w:val="32"/>
+          <w:szCs w:val="32"/>
+        </w:rPr>
+      </w:pPr>
+    </w:p>
+    <w:p>
+      <w:pPr>
+        <w:jc w:val="center"/>
+        <w:rPr>
+          <w:rFonts w:cs="Carlito"/>
+          <w:sz w:val="32"/>
+          <w:szCs w:val="32"/>
+        </w:rPr>
+      </w:pPr>
+      <w:r>
+        <w:rPr>
+          <w:rFonts w:cs="Carlito"/>
+          <w:sz w:val="32"/>
+          <w:szCs w:val="32"/>
+        </w:rPr>
+        <w:t>Break</w:t>
+      </w:r>
+    </w:p>
+    <w:p>
+      <w:pPr>
+        <w:jc w:val="both"/>
+        <w:rPr>
+          <w:rFonts w:cs="Carlito"/>
+          <w:sz w:val="32"/>
+          <w:szCs w:val="32"/>
+        </w:rPr>
+      </w:pPr>
+    </w:p>
+    <w:p>
+      <w:pPr>
+        <w:jc w:val="both"/>
+        <w:rPr>
           <w:rFonts w:cs="Carlito"/>
           <w:b/>
           <w:bCs/>
@@ -39927,6 +40740,7 @@
           <w:sz w:val="32"/>
           <w:szCs w:val="32"/>
         </w:rPr>
+        <w:lastRenderedPageBreak/>
         <w:t>Fluttercomponentlibrary.com</w:t>
       </w:r>
     </w:p>
@@ -40248,7 +41062,6 @@
           <w:sz w:val="32"/>
           <w:szCs w:val="32"/>
         </w:rPr>
-        <w:lastRenderedPageBreak/>
         <w:t>Then default or custom icons.</w:t>
       </w:r>
     </w:p>
@@ -40510,6 +41323,7 @@
           <w:sz w:val="32"/>
           <w:szCs w:val="32"/>
         </w:rPr>
+        <w:lastRenderedPageBreak/>
         <w:t xml:space="preserve">Package selection, where we can select popular and common necessary packages like </w:t>
       </w:r>
       <w:proofErr w:type="spellStart"/>
@@ -40843,6 +41657,41 @@
         </w:rPr>
         <w:t>Photo View</w:t>
       </w:r>
+    </w:p>
+    <w:p>
+      <w:pPr>
+        <w:jc w:val="both"/>
+        <w:rPr>
+          <w:rFonts w:cs="Carlito"/>
+          <w:sz w:val="32"/>
+          <w:szCs w:val="32"/>
+        </w:rPr>
+      </w:pPr>
+    </w:p>
+    <w:p>
+      <w:pPr>
+        <w:jc w:val="center"/>
+        <w:rPr>
+          <w:sz w:val="32"/>
+          <w:szCs w:val="32"/>
+        </w:rPr>
+      </w:pPr>
+      <w:r>
+        <w:rPr>
+          <w:sz w:val="32"/>
+          <w:szCs w:val="32"/>
+        </w:rPr>
+        <w:t>Break</w:t>
+      </w:r>
+    </w:p>
+    <w:p>
+      <w:pPr>
+        <w:jc w:val="both"/>
+        <w:rPr>
+          <w:sz w:val="32"/>
+          <w:szCs w:val="32"/>
+        </w:rPr>
+      </w:pPr>
     </w:p>
     <w:p>
       <w:pPr>
@@ -43315,9 +44164,9 @@
     </w:lvl>
   </w:abstractNum>
   <w:abstractNum w:abstractNumId="20" w15:restartNumberingAfterBreak="0">
-    <w:nsid w:val="44024354"/>
+    <w:nsid w:val="431836C6"/>
     <w:multiLevelType w:val="hybridMultilevel"/>
-    <w:tmpl w:val="5970B644"/>
+    <w:tmpl w:val="28CA1800"/>
     <w:lvl w:ilvl="0" w:tplc="04090001">
       <w:start w:val="1"/>
       <w:numFmt w:val="bullet"/>
@@ -43336,7 +44185,7 @@
       <w:lvlText w:val="o"/>
       <w:lvlJc w:val="left"/>
       <w:pPr>
-        <w:ind w:left="1080" w:hanging="360"/>
+        <w:ind w:left="1440" w:hanging="360"/>
       </w:pPr>
       <w:rPr>
         <w:rFonts w:ascii="Courier New" w:hAnsi="Courier New" w:cs="Courier New" w:hint="default"/>
@@ -43348,7 +44197,7 @@
       <w:lvlText w:val=""/>
       <w:lvlJc w:val="left"/>
       <w:pPr>
-        <w:ind w:left="1800" w:hanging="360"/>
+        <w:ind w:left="2160" w:hanging="360"/>
       </w:pPr>
       <w:rPr>
         <w:rFonts w:ascii="Wingdings" w:hAnsi="Wingdings" w:hint="default"/>
@@ -43360,7 +44209,7 @@
       <w:lvlText w:val=""/>
       <w:lvlJc w:val="left"/>
       <w:pPr>
-        <w:ind w:left="2520" w:hanging="360"/>
+        <w:ind w:left="2880" w:hanging="360"/>
       </w:pPr>
       <w:rPr>
         <w:rFonts w:ascii="Symbol" w:hAnsi="Symbol" w:hint="default"/>
@@ -43372,7 +44221,7 @@
       <w:lvlText w:val="o"/>
       <w:lvlJc w:val="left"/>
       <w:pPr>
-        <w:ind w:left="3240" w:hanging="360"/>
+        <w:ind w:left="3600" w:hanging="360"/>
       </w:pPr>
       <w:rPr>
         <w:rFonts w:ascii="Courier New" w:hAnsi="Courier New" w:cs="Courier New" w:hint="default"/>
@@ -43384,7 +44233,7 @@
       <w:lvlText w:val=""/>
       <w:lvlJc w:val="left"/>
       <w:pPr>
-        <w:ind w:left="3960" w:hanging="360"/>
+        <w:ind w:left="4320" w:hanging="360"/>
       </w:pPr>
       <w:rPr>
         <w:rFonts w:ascii="Wingdings" w:hAnsi="Wingdings" w:hint="default"/>
@@ -43396,7 +44245,7 @@
       <w:lvlText w:val=""/>
       <w:lvlJc w:val="left"/>
       <w:pPr>
-        <w:ind w:left="4680" w:hanging="360"/>
+        <w:ind w:left="5040" w:hanging="360"/>
       </w:pPr>
       <w:rPr>
         <w:rFonts w:ascii="Symbol" w:hAnsi="Symbol" w:hint="default"/>
@@ -43408,7 +44257,7 @@
       <w:lvlText w:val="o"/>
       <w:lvlJc w:val="left"/>
       <w:pPr>
-        <w:ind w:left="5400" w:hanging="360"/>
+        <w:ind w:left="5760" w:hanging="360"/>
       </w:pPr>
       <w:rPr>
         <w:rFonts w:ascii="Courier New" w:hAnsi="Courier New" w:cs="Courier New" w:hint="default"/>
@@ -43420,7 +44269,7 @@
       <w:lvlText w:val=""/>
       <w:lvlJc w:val="left"/>
       <w:pPr>
-        <w:ind w:left="6120" w:hanging="360"/>
+        <w:ind w:left="6480" w:hanging="360"/>
       </w:pPr>
       <w:rPr>
         <w:rFonts w:ascii="Wingdings" w:hAnsi="Wingdings" w:hint="default"/>
@@ -43428,6 +44277,119 @@
     </w:lvl>
   </w:abstractNum>
   <w:abstractNum w:abstractNumId="21" w15:restartNumberingAfterBreak="0">
+    <w:nsid w:val="44024354"/>
+    <w:multiLevelType w:val="hybridMultilevel"/>
+    <w:tmpl w:val="5970B644"/>
+    <w:lvl w:ilvl="0" w:tplc="04090001">
+      <w:start w:val="1"/>
+      <w:numFmt w:val="bullet"/>
+      <w:lvlText w:val=""/>
+      <w:lvlJc w:val="left"/>
+      <w:pPr>
+        <w:ind w:left="360" w:hanging="360"/>
+      </w:pPr>
+      <w:rPr>
+        <w:rFonts w:ascii="Symbol" w:hAnsi="Symbol" w:hint="default"/>
+      </w:rPr>
+    </w:lvl>
+    <w:lvl w:ilvl="1" w:tplc="04090003" w:tentative="1">
+      <w:start w:val="1"/>
+      <w:numFmt w:val="bullet"/>
+      <w:lvlText w:val="o"/>
+      <w:lvlJc w:val="left"/>
+      <w:pPr>
+        <w:ind w:left="1080" w:hanging="360"/>
+      </w:pPr>
+      <w:rPr>
+        <w:rFonts w:ascii="Courier New" w:hAnsi="Courier New" w:cs="Courier New" w:hint="default"/>
+      </w:rPr>
+    </w:lvl>
+    <w:lvl w:ilvl="2" w:tplc="04090005" w:tentative="1">
+      <w:start w:val="1"/>
+      <w:numFmt w:val="bullet"/>
+      <w:lvlText w:val=""/>
+      <w:lvlJc w:val="left"/>
+      <w:pPr>
+        <w:ind w:left="1800" w:hanging="360"/>
+      </w:pPr>
+      <w:rPr>
+        <w:rFonts w:ascii="Wingdings" w:hAnsi="Wingdings" w:hint="default"/>
+      </w:rPr>
+    </w:lvl>
+    <w:lvl w:ilvl="3" w:tplc="04090001" w:tentative="1">
+      <w:start w:val="1"/>
+      <w:numFmt w:val="bullet"/>
+      <w:lvlText w:val=""/>
+      <w:lvlJc w:val="left"/>
+      <w:pPr>
+        <w:ind w:left="2520" w:hanging="360"/>
+      </w:pPr>
+      <w:rPr>
+        <w:rFonts w:ascii="Symbol" w:hAnsi="Symbol" w:hint="default"/>
+      </w:rPr>
+    </w:lvl>
+    <w:lvl w:ilvl="4" w:tplc="04090003" w:tentative="1">
+      <w:start w:val="1"/>
+      <w:numFmt w:val="bullet"/>
+      <w:lvlText w:val="o"/>
+      <w:lvlJc w:val="left"/>
+      <w:pPr>
+        <w:ind w:left="3240" w:hanging="360"/>
+      </w:pPr>
+      <w:rPr>
+        <w:rFonts w:ascii="Courier New" w:hAnsi="Courier New" w:cs="Courier New" w:hint="default"/>
+      </w:rPr>
+    </w:lvl>
+    <w:lvl w:ilvl="5" w:tplc="04090005" w:tentative="1">
+      <w:start w:val="1"/>
+      <w:numFmt w:val="bullet"/>
+      <w:lvlText w:val=""/>
+      <w:lvlJc w:val="left"/>
+      <w:pPr>
+        <w:ind w:left="3960" w:hanging="360"/>
+      </w:pPr>
+      <w:rPr>
+        <w:rFonts w:ascii="Wingdings" w:hAnsi="Wingdings" w:hint="default"/>
+      </w:rPr>
+    </w:lvl>
+    <w:lvl w:ilvl="6" w:tplc="04090001" w:tentative="1">
+      <w:start w:val="1"/>
+      <w:numFmt w:val="bullet"/>
+      <w:lvlText w:val=""/>
+      <w:lvlJc w:val="left"/>
+      <w:pPr>
+        <w:ind w:left="4680" w:hanging="360"/>
+      </w:pPr>
+      <w:rPr>
+        <w:rFonts w:ascii="Symbol" w:hAnsi="Symbol" w:hint="default"/>
+      </w:rPr>
+    </w:lvl>
+    <w:lvl w:ilvl="7" w:tplc="04090003" w:tentative="1">
+      <w:start w:val="1"/>
+      <w:numFmt w:val="bullet"/>
+      <w:lvlText w:val="o"/>
+      <w:lvlJc w:val="left"/>
+      <w:pPr>
+        <w:ind w:left="5400" w:hanging="360"/>
+      </w:pPr>
+      <w:rPr>
+        <w:rFonts w:ascii="Courier New" w:hAnsi="Courier New" w:cs="Courier New" w:hint="default"/>
+      </w:rPr>
+    </w:lvl>
+    <w:lvl w:ilvl="8" w:tplc="04090005" w:tentative="1">
+      <w:start w:val="1"/>
+      <w:numFmt w:val="bullet"/>
+      <w:lvlText w:val=""/>
+      <w:lvlJc w:val="left"/>
+      <w:pPr>
+        <w:ind w:left="6120" w:hanging="360"/>
+      </w:pPr>
+      <w:rPr>
+        <w:rFonts w:ascii="Wingdings" w:hAnsi="Wingdings" w:hint="default"/>
+      </w:rPr>
+    </w:lvl>
+  </w:abstractNum>
+  <w:abstractNum w:abstractNumId="22" w15:restartNumberingAfterBreak="0">
     <w:nsid w:val="480C411D"/>
     <w:multiLevelType w:val="hybridMultilevel"/>
     <w:tmpl w:val="7388BA3C"/>
@@ -43540,7 +44502,7 @@
       </w:rPr>
     </w:lvl>
   </w:abstractNum>
-  <w:abstractNum w:abstractNumId="22" w15:restartNumberingAfterBreak="0">
+  <w:abstractNum w:abstractNumId="23" w15:restartNumberingAfterBreak="0">
     <w:nsid w:val="49197AF3"/>
     <w:multiLevelType w:val="hybridMultilevel"/>
     <w:tmpl w:val="9DD46390"/>
@@ -43631,7 +44593,7 @@
       </w:pPr>
     </w:lvl>
   </w:abstractNum>
-  <w:abstractNum w:abstractNumId="23" w15:restartNumberingAfterBreak="0">
+  <w:abstractNum w:abstractNumId="24" w15:restartNumberingAfterBreak="0">
     <w:nsid w:val="4DB604E0"/>
     <w:multiLevelType w:val="hybridMultilevel"/>
     <w:tmpl w:val="571417CA"/>
@@ -43744,7 +44706,7 @@
       </w:rPr>
     </w:lvl>
   </w:abstractNum>
-  <w:abstractNum w:abstractNumId="24" w15:restartNumberingAfterBreak="0">
+  <w:abstractNum w:abstractNumId="25" w15:restartNumberingAfterBreak="0">
     <w:nsid w:val="52305214"/>
     <w:multiLevelType w:val="hybridMultilevel"/>
     <w:tmpl w:val="135AC008"/>
@@ -43857,7 +44819,7 @@
       </w:rPr>
     </w:lvl>
   </w:abstractNum>
-  <w:abstractNum w:abstractNumId="25" w15:restartNumberingAfterBreak="0">
+  <w:abstractNum w:abstractNumId="26" w15:restartNumberingAfterBreak="0">
     <w:nsid w:val="53E12998"/>
     <w:multiLevelType w:val="hybridMultilevel"/>
     <w:tmpl w:val="EDD47322"/>
@@ -43970,7 +44932,7 @@
       </w:rPr>
     </w:lvl>
   </w:abstractNum>
-  <w:abstractNum w:abstractNumId="26" w15:restartNumberingAfterBreak="0">
+  <w:abstractNum w:abstractNumId="27" w15:restartNumberingAfterBreak="0">
     <w:nsid w:val="54296620"/>
     <w:multiLevelType w:val="hybridMultilevel"/>
     <w:tmpl w:val="51D4AF58"/>
@@ -44083,7 +45045,7 @@
       </w:rPr>
     </w:lvl>
   </w:abstractNum>
-  <w:abstractNum w:abstractNumId="27" w15:restartNumberingAfterBreak="0">
+  <w:abstractNum w:abstractNumId="28" w15:restartNumberingAfterBreak="0">
     <w:nsid w:val="59F01BC5"/>
     <w:multiLevelType w:val="hybridMultilevel"/>
     <w:tmpl w:val="1F4295A8"/>
@@ -44196,7 +45158,7 @@
       </w:rPr>
     </w:lvl>
   </w:abstractNum>
-  <w:abstractNum w:abstractNumId="28" w15:restartNumberingAfterBreak="0">
+  <w:abstractNum w:abstractNumId="29" w15:restartNumberingAfterBreak="0">
     <w:nsid w:val="5D4B5128"/>
     <w:multiLevelType w:val="hybridMultilevel"/>
     <w:tmpl w:val="9D289C5A"/>
@@ -44286,7 +45248,7 @@
       </w:pPr>
     </w:lvl>
   </w:abstractNum>
-  <w:abstractNum w:abstractNumId="29" w15:restartNumberingAfterBreak="0">
+  <w:abstractNum w:abstractNumId="30" w15:restartNumberingAfterBreak="0">
     <w:nsid w:val="5F5B6DB5"/>
     <w:multiLevelType w:val="hybridMultilevel"/>
     <w:tmpl w:val="2AD4914E"/>
@@ -44399,7 +45361,7 @@
       </w:rPr>
     </w:lvl>
   </w:abstractNum>
-  <w:abstractNum w:abstractNumId="30" w15:restartNumberingAfterBreak="0">
+  <w:abstractNum w:abstractNumId="31" w15:restartNumberingAfterBreak="0">
     <w:nsid w:val="607C35FE"/>
     <w:multiLevelType w:val="hybridMultilevel"/>
     <w:tmpl w:val="3DB601F4"/>
@@ -44512,7 +45474,7 @@
       </w:rPr>
     </w:lvl>
   </w:abstractNum>
-  <w:abstractNum w:abstractNumId="31" w15:restartNumberingAfterBreak="0">
+  <w:abstractNum w:abstractNumId="32" w15:restartNumberingAfterBreak="0">
     <w:nsid w:val="62E236E0"/>
     <w:multiLevelType w:val="hybridMultilevel"/>
     <w:tmpl w:val="D5A48EA6"/>
@@ -44625,7 +45587,7 @@
       </w:rPr>
     </w:lvl>
   </w:abstractNum>
-  <w:abstractNum w:abstractNumId="32" w15:restartNumberingAfterBreak="0">
+  <w:abstractNum w:abstractNumId="33" w15:restartNumberingAfterBreak="0">
     <w:nsid w:val="65BA6D9A"/>
     <w:multiLevelType w:val="hybridMultilevel"/>
     <w:tmpl w:val="F8128F4C"/>
@@ -44738,7 +45700,7 @@
       </w:rPr>
     </w:lvl>
   </w:abstractNum>
-  <w:abstractNum w:abstractNumId="33" w15:restartNumberingAfterBreak="0">
+  <w:abstractNum w:abstractNumId="34" w15:restartNumberingAfterBreak="0">
     <w:nsid w:val="69C62B35"/>
     <w:multiLevelType w:val="hybridMultilevel"/>
     <w:tmpl w:val="AD007F0A"/>
@@ -44851,7 +45813,7 @@
       </w:rPr>
     </w:lvl>
   </w:abstractNum>
-  <w:abstractNum w:abstractNumId="34" w15:restartNumberingAfterBreak="0">
+  <w:abstractNum w:abstractNumId="35" w15:restartNumberingAfterBreak="0">
     <w:nsid w:val="6AED576D"/>
     <w:multiLevelType w:val="hybridMultilevel"/>
     <w:tmpl w:val="8E26DC9C"/>
@@ -44964,7 +45926,7 @@
       </w:rPr>
     </w:lvl>
   </w:abstractNum>
-  <w:abstractNum w:abstractNumId="35" w15:restartNumberingAfterBreak="0">
+  <w:abstractNum w:abstractNumId="36" w15:restartNumberingAfterBreak="0">
     <w:nsid w:val="6FB2533A"/>
     <w:multiLevelType w:val="hybridMultilevel"/>
     <w:tmpl w:val="265C1622"/>
@@ -45077,7 +46039,7 @@
       </w:rPr>
     </w:lvl>
   </w:abstractNum>
-  <w:abstractNum w:abstractNumId="36" w15:restartNumberingAfterBreak="0">
+  <w:abstractNum w:abstractNumId="37" w15:restartNumberingAfterBreak="0">
     <w:nsid w:val="709C63F5"/>
     <w:multiLevelType w:val="hybridMultilevel"/>
     <w:tmpl w:val="D0701786"/>
@@ -45190,7 +46152,7 @@
       </w:rPr>
     </w:lvl>
   </w:abstractNum>
-  <w:abstractNum w:abstractNumId="37" w15:restartNumberingAfterBreak="0">
+  <w:abstractNum w:abstractNumId="38" w15:restartNumberingAfterBreak="0">
     <w:nsid w:val="737B0D5E"/>
     <w:multiLevelType w:val="hybridMultilevel"/>
     <w:tmpl w:val="8BE2F570"/>
@@ -45281,7 +46243,7 @@
       </w:pPr>
     </w:lvl>
   </w:abstractNum>
-  <w:abstractNum w:abstractNumId="38" w15:restartNumberingAfterBreak="0">
+  <w:abstractNum w:abstractNumId="39" w15:restartNumberingAfterBreak="0">
     <w:nsid w:val="76A13F40"/>
     <w:multiLevelType w:val="hybridMultilevel"/>
     <w:tmpl w:val="8A28AE40"/>
@@ -45394,7 +46356,7 @@
       </w:rPr>
     </w:lvl>
   </w:abstractNum>
-  <w:abstractNum w:abstractNumId="39" w15:restartNumberingAfterBreak="0">
+  <w:abstractNum w:abstractNumId="40" w15:restartNumberingAfterBreak="0">
     <w:nsid w:val="78E708D2"/>
     <w:multiLevelType w:val="hybridMultilevel"/>
     <w:tmpl w:val="3920D09A"/>
@@ -45507,7 +46469,7 @@
       </w:rPr>
     </w:lvl>
   </w:abstractNum>
-  <w:abstractNum w:abstractNumId="40" w15:restartNumberingAfterBreak="0">
+  <w:abstractNum w:abstractNumId="41" w15:restartNumberingAfterBreak="0">
     <w:nsid w:val="791A36E2"/>
     <w:multiLevelType w:val="hybridMultilevel"/>
     <w:tmpl w:val="8E28FC3A"/>
@@ -45620,7 +46582,7 @@
       </w:rPr>
     </w:lvl>
   </w:abstractNum>
-  <w:abstractNum w:abstractNumId="41" w15:restartNumberingAfterBreak="0">
+  <w:abstractNum w:abstractNumId="42" w15:restartNumberingAfterBreak="0">
     <w:nsid w:val="7F693639"/>
     <w:multiLevelType w:val="hybridMultilevel"/>
     <w:tmpl w:val="DCF061EC"/>
@@ -45737,16 +46699,16 @@
     <w:abstractNumId w:val="16"/>
   </w:num>
   <w:num w:numId="2" w16cid:durableId="1143933083">
-    <w:abstractNumId w:val="31"/>
+    <w:abstractNumId w:val="32"/>
   </w:num>
   <w:num w:numId="3" w16cid:durableId="379090341">
     <w:abstractNumId w:val="0"/>
   </w:num>
   <w:num w:numId="4" w16cid:durableId="1672678930">
-    <w:abstractNumId w:val="35"/>
+    <w:abstractNumId w:val="36"/>
   </w:num>
   <w:num w:numId="5" w16cid:durableId="520703883">
-    <w:abstractNumId w:val="25"/>
+    <w:abstractNumId w:val="26"/>
   </w:num>
   <w:num w:numId="6" w16cid:durableId="1851673138">
     <w:abstractNumId w:val="7"/>
@@ -45755,16 +46717,16 @@
     <w:abstractNumId w:val="1"/>
   </w:num>
   <w:num w:numId="8" w16cid:durableId="366151325">
-    <w:abstractNumId w:val="26"/>
+    <w:abstractNumId w:val="27"/>
   </w:num>
   <w:num w:numId="9" w16cid:durableId="1308441164">
     <w:abstractNumId w:val="18"/>
   </w:num>
   <w:num w:numId="10" w16cid:durableId="1744138132">
-    <w:abstractNumId w:val="20"/>
+    <w:abstractNumId w:val="21"/>
   </w:num>
   <w:num w:numId="11" w16cid:durableId="950941188">
-    <w:abstractNumId w:val="22"/>
+    <w:abstractNumId w:val="23"/>
   </w:num>
   <w:num w:numId="12" w16cid:durableId="256183794">
     <w:abstractNumId w:val="11"/>
@@ -45773,13 +46735,13 @@
     <w:abstractNumId w:val="10"/>
   </w:num>
   <w:num w:numId="14" w16cid:durableId="1761100776">
-    <w:abstractNumId w:val="30"/>
+    <w:abstractNumId w:val="31"/>
   </w:num>
   <w:num w:numId="15" w16cid:durableId="210845980">
-    <w:abstractNumId w:val="41"/>
+    <w:abstractNumId w:val="42"/>
   </w:num>
   <w:num w:numId="16" w16cid:durableId="244415424">
-    <w:abstractNumId w:val="27"/>
+    <w:abstractNumId w:val="28"/>
   </w:num>
   <w:num w:numId="17" w16cid:durableId="373848333">
     <w:abstractNumId w:val="17"/>
@@ -45788,22 +46750,22 @@
     <w:abstractNumId w:val="13"/>
   </w:num>
   <w:num w:numId="19" w16cid:durableId="185867612">
-    <w:abstractNumId w:val="38"/>
+    <w:abstractNumId w:val="39"/>
   </w:num>
   <w:num w:numId="20" w16cid:durableId="1304889511">
     <w:abstractNumId w:val="12"/>
   </w:num>
   <w:num w:numId="21" w16cid:durableId="572349668">
-    <w:abstractNumId w:val="33"/>
+    <w:abstractNumId w:val="34"/>
   </w:num>
   <w:num w:numId="22" w16cid:durableId="1356888524">
-    <w:abstractNumId w:val="21"/>
+    <w:abstractNumId w:val="22"/>
   </w:num>
   <w:num w:numId="23" w16cid:durableId="371075047">
-    <w:abstractNumId w:val="39"/>
+    <w:abstractNumId w:val="40"/>
   </w:num>
   <w:num w:numId="24" w16cid:durableId="1905867672">
-    <w:abstractNumId w:val="32"/>
+    <w:abstractNumId w:val="33"/>
   </w:num>
   <w:num w:numId="25" w16cid:durableId="159547294">
     <w:abstractNumId w:val="3"/>
@@ -45821,43 +46783,46 @@
     <w:abstractNumId w:val="2"/>
   </w:num>
   <w:num w:numId="30" w16cid:durableId="77137131">
-    <w:abstractNumId w:val="28"/>
+    <w:abstractNumId w:val="29"/>
   </w:num>
   <w:num w:numId="31" w16cid:durableId="1870295448">
     <w:abstractNumId w:val="8"/>
   </w:num>
   <w:num w:numId="32" w16cid:durableId="1042169529">
-    <w:abstractNumId w:val="36"/>
+    <w:abstractNumId w:val="37"/>
   </w:num>
   <w:num w:numId="33" w16cid:durableId="1568682573">
-    <w:abstractNumId w:val="40"/>
+    <w:abstractNumId w:val="41"/>
   </w:num>
   <w:num w:numId="34" w16cid:durableId="2111123771">
-    <w:abstractNumId w:val="29"/>
+    <w:abstractNumId w:val="30"/>
   </w:num>
   <w:num w:numId="35" w16cid:durableId="1725644557">
     <w:abstractNumId w:val="6"/>
   </w:num>
   <w:num w:numId="36" w16cid:durableId="747728442">
-    <w:abstractNumId w:val="34"/>
+    <w:abstractNumId w:val="35"/>
   </w:num>
   <w:num w:numId="37" w16cid:durableId="1988629226">
-    <w:abstractNumId w:val="23"/>
+    <w:abstractNumId w:val="24"/>
   </w:num>
   <w:num w:numId="38" w16cid:durableId="1397702807">
-    <w:abstractNumId w:val="37"/>
+    <w:abstractNumId w:val="38"/>
   </w:num>
   <w:num w:numId="39" w16cid:durableId="1470173009">
     <w:abstractNumId w:val="19"/>
   </w:num>
   <w:num w:numId="40" w16cid:durableId="2089955940">
-    <w:abstractNumId w:val="24"/>
+    <w:abstractNumId w:val="25"/>
   </w:num>
   <w:num w:numId="41" w16cid:durableId="2110393214">
     <w:abstractNumId w:val="5"/>
   </w:num>
   <w:num w:numId="42" w16cid:durableId="840192856">
     <w:abstractNumId w:val="4"/>
+  </w:num>
+  <w:num w:numId="43" w16cid:durableId="115415679">
+    <w:abstractNumId w:val="20"/>
   </w:num>
   <w:numIdMacAtCleanup w:val="34"/>
 </w:numbering>
@@ -46466,6 +47431,7 @@
   <w:style w:type="character" w:default="1" w:styleId="DefaultParagraphFont">
     <w:name w:val="Default Paragraph Font"/>
     <w:uiPriority w:val="1"/>
+    <w:semiHidden/>
     <w:unhideWhenUsed/>
   </w:style>
   <w:style w:type="table" w:default="1" w:styleId="TableNormal">

</xml_diff>